<commit_message>
v1.11.173: Relationships map wraps to its pane + demo-mode inconsistencies fixed
Relationships: each band was one row (6 children = 1044 px in a ~780 px pane at 1280), hiding
boxes behind a sideways scroll that reset on every table switch. Rows now wrap to the pane's
measured width, centred; pure nodesPerRow / wrapRow + 3 tests. Names fit 20 chars, full name and
relationship as a tooltip on every box.

Demo mode: option sets return each column's own choices (not Active/Inactive everywhere); security
roles follow each demo user's title and access mode (the read-only analyst no longer holds System
Administrator); the Account form's Contacts subgrid renders a contact view ("Active Contacts").

Deep-dive videos re-rendered for Relationships (no more panning), Apps, Users & Licenses and
Metadata (option-set chapter now on Industry), plus the tour. 350 tests, ESLint clean.

Co-Authored-By: Claude Opus 5.5 <noreply@anthropic.com>
</commit_message>
<xml_diff>
--- a/docs/Colvio_Spec_Technique.docx
+++ b/docs/Colvio_Spec_Technique.docx
@@ -433,7 +433,7 @@
                 <w:sz w:val="20"/>
                 <w:szCs w:val="20"/>
               </w:rPr>
-              <w:t xml:space="preserve">347 (Vitest)</w:t>
+              <w:t xml:space="preserve">350 (Vitest)</w:t>
             </w:r>
           </w:p>
         </w:tc>
@@ -3529,7 +3529,7 @@
           <w:b/>
           <w:bCs/>
         </w:rPr>
-        <w:t xml:space="preserve">347 tests Vitest</w:t>
+        <w:t xml:space="preserve">350 tests Vitest</w:t>
       </w:r>
       <w:r>
         <w:t xml:space="preserve"> : parseur SQL (43), envDetect/sqlNative/teamUtils/relGraphUtils/loginHistoryUtils (badge d'environnement fail-closed, moteur SQL natif, Teams, classification des relations, canaux d'accès de l'audit), loaderUtils (transforms, parser RFC-4180, coercition typée), updateUtils/filterUtils/historyUtils (écritures, filtres, historique), adoption/BU/solutions/doublons, couverture i18n (chaque clé t() présente dans les deux locales). ESLint (règles vrais-bugs : no-undef, no-dupe-keys…) dans chaque passe pré-release.</w:t>

</xml_diff>